<commit_message>
finished logic exercise 8
</commit_message>
<xml_diff>
--- a/Fall-2025/logic-for-cs/exercise-set-8.docx
+++ b/Fall-2025/logic-for-cs/exercise-set-8.docx
@@ -821,6 +821,829 @@
                 <w:rFonts w:ascii="Cambria Math" w:hAnsi="Cambria Math" w:cs="Cambria Math"/>
               </w:rPr>
               <w:t xml:space="preserve"> ∧ G ≡ ∀x(F ∧ G)</w:t>
+            </w:r>
+          </w:p>
+        </w:tc>
+      </w:tr>
+    </w:tbl>
+    <w:p/>
+    <w:p>
+      <w:r>
+        <w:rPr>
+          <w:b/>
+          <w:bCs/>
+        </w:rPr>
+        <w:t>Exercise 54</w:t>
+      </w:r>
+    </w:p>
+    <w:p>
+      <w:r>
+        <w:t xml:space="preserve">We can see that this is false by putting the statements into plain English. Say predicate P is the binary operator greater than (&gt;). Then </w:t>
+      </w:r>
+      <w:r>
+        <w:rPr>
+          <w:rFonts w:ascii="Cambria Math" w:hAnsi="Cambria Math" w:cs="Cambria Math"/>
+        </w:rPr>
+        <w:t>∀</w:t>
+      </w:r>
+      <w:proofErr w:type="spellStart"/>
+      <w:r>
+        <w:t>x</w:t>
+      </w:r>
+      <w:r>
+        <w:rPr>
+          <w:rFonts w:ascii="Cambria Math" w:hAnsi="Cambria Math" w:cs="Cambria Math"/>
+        </w:rPr>
+        <w:t>∃</w:t>
+      </w:r>
+      <w:r>
+        <w:t>yP</w:t>
+      </w:r>
+      <w:proofErr w:type="spellEnd"/>
+      <w:r>
+        <w:t xml:space="preserve"> (x, y)</w:t>
+      </w:r>
+      <w:r>
+        <w:t xml:space="preserve"> means that for all numbers x, there exists a </w:t>
+      </w:r>
+      <w:r>
+        <w:lastRenderedPageBreak/>
+        <w:t xml:space="preserve">number y such that x is greater than y (x &gt; y). Additionally, </w:t>
+      </w:r>
+      <w:r>
+        <w:rPr>
+          <w:rFonts w:ascii="Cambria Math" w:hAnsi="Cambria Math" w:cs="Cambria Math"/>
+        </w:rPr>
+        <w:t>∃</w:t>
+      </w:r>
+      <w:proofErr w:type="spellStart"/>
+      <w:r>
+        <w:t>u</w:t>
+      </w:r>
+      <w:r>
+        <w:rPr>
+          <w:rFonts w:ascii="Cambria Math" w:hAnsi="Cambria Math" w:cs="Cambria Math"/>
+        </w:rPr>
+        <w:t>∀</w:t>
+      </w:r>
+      <w:r>
+        <w:t>vP</w:t>
+      </w:r>
+      <w:proofErr w:type="spellEnd"/>
+      <w:r>
+        <w:t xml:space="preserve"> (v, u)</w:t>
+      </w:r>
+      <w:r>
+        <w:t xml:space="preserve"> would mean that for some number u, all numbers v are greater than u (v &gt; u). These two statements are very clearly different in meaning, and thus, </w:t>
+      </w:r>
+      <w:r>
+        <w:rPr>
+          <w:rFonts w:ascii="Cambria Math" w:hAnsi="Cambria Math" w:cs="Cambria Math"/>
+        </w:rPr>
+        <w:t>∀</w:t>
+      </w:r>
+      <w:proofErr w:type="spellStart"/>
+      <w:r>
+        <w:t>x</w:t>
+      </w:r>
+      <w:r>
+        <w:rPr>
+          <w:rFonts w:ascii="Cambria Math" w:hAnsi="Cambria Math" w:cs="Cambria Math"/>
+        </w:rPr>
+        <w:t>∃</w:t>
+      </w:r>
+      <w:r>
+        <w:t>yP</w:t>
+      </w:r>
+      <w:proofErr w:type="spellEnd"/>
+      <w:r>
+        <w:t xml:space="preserve"> (x, y)</w:t>
+      </w:r>
+      <w:r>
+        <w:t xml:space="preserve"> </w:t>
+      </w:r>
+      <w:r>
+        <w:t xml:space="preserve"> ̸ ≡ </w:t>
+      </w:r>
+      <w:r>
+        <w:rPr>
+          <w:rFonts w:ascii="Cambria Math" w:hAnsi="Cambria Math" w:cs="Cambria Math"/>
+        </w:rPr>
+        <w:t>∃</w:t>
+      </w:r>
+      <w:proofErr w:type="spellStart"/>
+      <w:r>
+        <w:t>u</w:t>
+      </w:r>
+      <w:r>
+        <w:rPr>
+          <w:rFonts w:ascii="Cambria Math" w:hAnsi="Cambria Math" w:cs="Cambria Math"/>
+        </w:rPr>
+        <w:t>∀</w:t>
+      </w:r>
+      <w:r>
+        <w:t>vP</w:t>
+      </w:r>
+      <w:proofErr w:type="spellEnd"/>
+      <w:r>
+        <w:t xml:space="preserve"> (v, u)</w:t>
+      </w:r>
+      <w:r>
+        <w:t>.</w:t>
+      </w:r>
+    </w:p>
+    <w:p>
+      <w:r>
+        <w:rPr>
+          <w:b/>
+          <w:bCs/>
+        </w:rPr>
+        <w:t>Exercise 55</w:t>
+      </w:r>
+    </w:p>
+    <w:tbl>
+      <w:tblPr>
+        <w:tblStyle w:val="TableGrid"/>
+        <w:tblW w:w="10440" w:type="dxa"/>
+        <w:tblInd w:w="-365" w:type="dxa"/>
+        <w:tblLook w:val="04A0" w:firstRow="1" w:lastRow="0" w:firstColumn="1" w:lastColumn="0" w:noHBand="0" w:noVBand="1"/>
+      </w:tblPr>
+      <w:tblGrid>
+        <w:gridCol w:w="7650"/>
+        <w:gridCol w:w="2790"/>
+      </w:tblGrid>
+      <w:tr>
+        <w:trPr>
+          <w:trHeight w:val="305"/>
+        </w:trPr>
+        <w:tc>
+          <w:tcPr>
+            <w:tcW w:w="7650" w:type="dxa"/>
+            <w:vAlign w:val="center"/>
+          </w:tcPr>
+          <w:p>
+            <w:pPr>
+              <w:jc w:val="center"/>
+              <w:rPr>
+                <w:rFonts w:ascii="Cambria Math" w:hAnsi="Cambria Math" w:cs="Cambria Math"/>
+                <w:u w:val="single"/>
+              </w:rPr>
+            </w:pPr>
+            <w:r>
+              <w:rPr>
+                <w:rFonts w:ascii="Cambria Math" w:hAnsi="Cambria Math" w:cs="Cambria Math"/>
+                <w:u w:val="single"/>
+              </w:rPr>
+              <w:t>Current Expression</w:t>
+            </w:r>
+          </w:p>
+        </w:tc>
+        <w:tc>
+          <w:tcPr>
+            <w:tcW w:w="2790" w:type="dxa"/>
+            <w:vAlign w:val="center"/>
+          </w:tcPr>
+          <w:p>
+            <w:pPr>
+              <w:jc w:val="center"/>
+            </w:pPr>
+            <w:r>
+              <w:rPr>
+                <w:u w:val="single"/>
+              </w:rPr>
+              <w:t>Rule</w:t>
+            </w:r>
+          </w:p>
+        </w:tc>
+      </w:tr>
+      <w:tr>
+        <w:tc>
+          <w:tcPr>
+            <w:tcW w:w="7650" w:type="dxa"/>
+            <w:vAlign w:val="center"/>
+          </w:tcPr>
+          <w:p>
+            <w:pPr>
+              <w:jc w:val="center"/>
+            </w:pPr>
+            <w:r>
+              <w:rPr>
+                <w:rFonts w:ascii="Cambria Math" w:hAnsi="Cambria Math" w:cs="Cambria Math"/>
+              </w:rPr>
+              <w:t>∀x(P(x) → (∃y(O(x, y) ∧ C(y)) ∧ (∀z(R(x, z) → H(z)))))</w:t>
+            </w:r>
+          </w:p>
+        </w:tc>
+        <w:tc>
+          <w:tcPr>
+            <w:tcW w:w="2790" w:type="dxa"/>
+            <w:vAlign w:val="center"/>
+          </w:tcPr>
+          <w:p>
+            <w:pPr>
+              <w:jc w:val="center"/>
+            </w:pPr>
+            <w:r>
+              <w:t>Starting point</w:t>
+            </w:r>
+          </w:p>
+        </w:tc>
+      </w:tr>
+      <w:tr>
+        <w:tc>
+          <w:tcPr>
+            <w:tcW w:w="7650" w:type="dxa"/>
+            <w:vAlign w:val="center"/>
+          </w:tcPr>
+          <w:p>
+            <w:pPr>
+              <w:jc w:val="center"/>
+            </w:pPr>
+            <w:r>
+              <w:rPr>
+                <w:rFonts w:ascii="Cambria Math" w:hAnsi="Cambria Math" w:cs="Cambria Math"/>
+              </w:rPr>
+              <w:t>∀x(¬P(x) ∨ (∃y(O(x, y) ∧ C(y)) ∧ (∀z(R(x, z) → H(z)))))</w:t>
+            </w:r>
+          </w:p>
+        </w:tc>
+        <w:tc>
+          <w:tcPr>
+            <w:tcW w:w="2790" w:type="dxa"/>
+            <w:vAlign w:val="center"/>
+          </w:tcPr>
+          <w:p>
+            <w:pPr>
+              <w:jc w:val="center"/>
+            </w:pPr>
+            <w:r>
+              <w:t>Def. of conditionals</w:t>
+            </w:r>
+          </w:p>
+        </w:tc>
+      </w:tr>
+      <w:tr>
+        <w:tc>
+          <w:tcPr>
+            <w:tcW w:w="7650" w:type="dxa"/>
+            <w:vAlign w:val="center"/>
+          </w:tcPr>
+          <w:p>
+            <w:pPr>
+              <w:jc w:val="center"/>
+            </w:pPr>
+            <w:r>
+              <w:rPr>
+                <w:rFonts w:ascii="Cambria Math" w:hAnsi="Cambria Math" w:cs="Cambria Math"/>
+              </w:rPr>
+              <w:t>∀x(</w:t>
+            </w:r>
+            <w:r>
+              <w:rPr>
+                <w:rFonts w:ascii="Cambria Math" w:hAnsi="Cambria Math" w:cs="Cambria Math"/>
+              </w:rPr>
+              <w:t>(</w:t>
+            </w:r>
+            <w:r>
+              <w:rPr>
+                <w:rFonts w:ascii="Cambria Math" w:hAnsi="Cambria Math" w:cs="Cambria Math"/>
+              </w:rPr>
+              <w:t>¬P(x) ∨ (∃y(O(x, y) ∧ C(y))</w:t>
+            </w:r>
+            <w:r>
+              <w:rPr>
+                <w:rFonts w:ascii="Cambria Math" w:hAnsi="Cambria Math" w:cs="Cambria Math"/>
+              </w:rPr>
+              <w:t>))</w:t>
+            </w:r>
+            <w:r>
+              <w:rPr>
+                <w:rFonts w:ascii="Cambria Math" w:hAnsi="Cambria Math" w:cs="Cambria Math"/>
+              </w:rPr>
+              <w:t xml:space="preserve"> ∧ (¬P(x)</w:t>
+            </w:r>
+            <w:r>
+              <w:rPr>
+                <w:rFonts w:ascii="Cambria Math" w:hAnsi="Cambria Math" w:cs="Cambria Math"/>
+              </w:rPr>
+              <w:t xml:space="preserve"> </w:t>
+            </w:r>
+            <w:r>
+              <w:rPr>
+                <w:rFonts w:ascii="Cambria Math" w:hAnsi="Cambria Math" w:cs="Cambria Math"/>
+              </w:rPr>
+              <w:t>∨ (∀z(R(x, z) → H(z)))))</w:t>
+            </w:r>
+          </w:p>
+        </w:tc>
+        <w:tc>
+          <w:tcPr>
+            <w:tcW w:w="2790" w:type="dxa"/>
+            <w:vAlign w:val="center"/>
+          </w:tcPr>
+          <w:p>
+            <w:pPr>
+              <w:jc w:val="center"/>
+              <w:rPr>
+                <w:rFonts w:ascii="Cambria Math" w:hAnsi="Cambria Math" w:cs="Cambria Math"/>
+              </w:rPr>
+            </w:pPr>
+            <w:r>
+              <w:rPr>
+                <w:rFonts w:ascii="Cambria Math" w:hAnsi="Cambria Math" w:cs="Cambria Math"/>
+              </w:rPr>
+              <w:t>Distributivity</w:t>
+            </w:r>
+          </w:p>
+        </w:tc>
+      </w:tr>
+      <w:tr>
+        <w:tc>
+          <w:tcPr>
+            <w:tcW w:w="7650" w:type="dxa"/>
+            <w:vAlign w:val="center"/>
+          </w:tcPr>
+          <w:p>
+            <w:pPr>
+              <w:jc w:val="center"/>
+            </w:pPr>
+            <w:r>
+              <w:rPr>
+                <w:rFonts w:ascii="Cambria Math" w:hAnsi="Cambria Math" w:cs="Cambria Math"/>
+              </w:rPr>
+              <w:t>∀x((∃y</w:t>
+            </w:r>
+            <w:r>
+              <w:rPr>
+                <w:rFonts w:ascii="Cambria Math" w:hAnsi="Cambria Math" w:cs="Cambria Math"/>
+              </w:rPr>
+              <w:t>(</w:t>
+            </w:r>
+            <w:r>
+              <w:rPr>
+                <w:rFonts w:ascii="Cambria Math" w:hAnsi="Cambria Math" w:cs="Cambria Math"/>
+              </w:rPr>
+              <w:t>¬P(x) ∨ (O(x, y) ∧ C(y))</w:t>
+            </w:r>
+            <w:r>
+              <w:rPr>
+                <w:rFonts w:ascii="Cambria Math" w:hAnsi="Cambria Math" w:cs="Cambria Math"/>
+              </w:rPr>
+              <w:t>))</w:t>
+            </w:r>
+            <w:r>
+              <w:rPr>
+                <w:rFonts w:ascii="Cambria Math" w:hAnsi="Cambria Math" w:cs="Cambria Math"/>
+              </w:rPr>
+              <w:t xml:space="preserve"> ∧ (∀z(¬P(x) ∨ (R(x, z) → H(z)))))</w:t>
+            </w:r>
+          </w:p>
+        </w:tc>
+        <w:tc>
+          <w:tcPr>
+            <w:tcW w:w="2790" w:type="dxa"/>
+            <w:vAlign w:val="center"/>
+          </w:tcPr>
+          <w:p>
+            <w:pPr>
+              <w:jc w:val="center"/>
+              <w:rPr>
+                <w:rFonts w:ascii="Cambria Math" w:hAnsi="Cambria Math" w:cs="Cambria Math"/>
+              </w:rPr>
+            </w:pPr>
+            <w:r>
+              <w:rPr>
+                <w:rFonts w:ascii="Cambria Math" w:hAnsi="Cambria Math" w:cs="Cambria Math"/>
+              </w:rPr>
+              <w:t>∀</w:t>
+            </w:r>
+            <w:proofErr w:type="spellStart"/>
+            <w:r>
+              <w:rPr>
+                <w:rFonts w:ascii="Cambria Math" w:hAnsi="Cambria Math" w:cs="Cambria Math"/>
+              </w:rPr>
+              <w:t>xF</w:t>
+            </w:r>
+            <w:proofErr w:type="spellEnd"/>
+            <w:r>
+              <w:rPr>
+                <w:rFonts w:ascii="Cambria Math" w:hAnsi="Cambria Math" w:cs="Cambria Math"/>
+              </w:rPr>
+              <w:t xml:space="preserve"> ∨ G ≡ ∀x(F ∨ G)</w:t>
+            </w:r>
+          </w:p>
+          <w:p>
+            <w:pPr>
+              <w:jc w:val="center"/>
+              <w:rPr>
+                <w:rFonts w:ascii="Cambria Math" w:hAnsi="Cambria Math" w:cs="Cambria Math"/>
+              </w:rPr>
+            </w:pPr>
+            <w:r>
+              <w:rPr>
+                <w:rFonts w:ascii="Cambria Math" w:hAnsi="Cambria Math" w:cs="Cambria Math"/>
+              </w:rPr>
+              <w:t xml:space="preserve">and </w:t>
+            </w:r>
+            <w:r>
+              <w:rPr>
+                <w:rFonts w:ascii="Cambria Math" w:hAnsi="Cambria Math" w:cs="Cambria Math"/>
+              </w:rPr>
+              <w:t>∃</w:t>
+            </w:r>
+            <w:proofErr w:type="spellStart"/>
+            <w:r>
+              <w:rPr>
+                <w:rFonts w:ascii="Cambria Math" w:hAnsi="Cambria Math" w:cs="Cambria Math"/>
+              </w:rPr>
+              <w:t>xF</w:t>
+            </w:r>
+            <w:proofErr w:type="spellEnd"/>
+            <w:r>
+              <w:rPr>
+                <w:rFonts w:ascii="Cambria Math" w:hAnsi="Cambria Math" w:cs="Cambria Math"/>
+              </w:rPr>
+              <w:t xml:space="preserve"> ∨ G ≡ ∃x(F ∨ G</w:t>
+            </w:r>
+            <w:r>
+              <w:rPr>
+                <w:rFonts w:ascii="Cambria Math" w:hAnsi="Cambria Math" w:cs="Cambria Math"/>
+              </w:rPr>
+              <w:t>)</w:t>
+            </w:r>
+          </w:p>
+        </w:tc>
+      </w:tr>
+      <w:tr>
+        <w:tc>
+          <w:tcPr>
+            <w:tcW w:w="7650" w:type="dxa"/>
+            <w:vAlign w:val="center"/>
+          </w:tcPr>
+          <w:p>
+            <w:pPr>
+              <w:jc w:val="center"/>
+            </w:pPr>
+            <w:r>
+              <w:rPr>
+                <w:rFonts w:ascii="Cambria Math" w:hAnsi="Cambria Math" w:cs="Cambria Math"/>
+              </w:rPr>
+              <w:t>∀</w:t>
+            </w:r>
+            <w:proofErr w:type="spellStart"/>
+            <w:r>
+              <w:rPr>
+                <w:rFonts w:ascii="Cambria Math" w:hAnsi="Cambria Math" w:cs="Cambria Math"/>
+              </w:rPr>
+              <w:t>z∀x∃y</w:t>
+            </w:r>
+            <w:proofErr w:type="spellEnd"/>
+            <w:r>
+              <w:rPr>
+                <w:rFonts w:ascii="Cambria Math" w:hAnsi="Cambria Math" w:cs="Cambria Math"/>
+              </w:rPr>
+              <w:t>(</w:t>
+            </w:r>
+            <w:r>
+              <w:rPr>
+                <w:rFonts w:ascii="Cambria Math" w:hAnsi="Cambria Math" w:cs="Cambria Math"/>
+              </w:rPr>
+              <w:t>(</w:t>
+            </w:r>
+            <w:r>
+              <w:rPr>
+                <w:rFonts w:ascii="Cambria Math" w:hAnsi="Cambria Math" w:cs="Cambria Math"/>
+              </w:rPr>
+              <w:t>¬P(x) ∨ (O(x, y) ∧ C(y))</w:t>
+            </w:r>
+            <w:r>
+              <w:rPr>
+                <w:rFonts w:ascii="Cambria Math" w:hAnsi="Cambria Math" w:cs="Cambria Math"/>
+              </w:rPr>
+              <w:t>)</w:t>
+            </w:r>
+            <w:r>
+              <w:rPr>
+                <w:rFonts w:ascii="Cambria Math" w:hAnsi="Cambria Math" w:cs="Cambria Math"/>
+              </w:rPr>
+              <w:t xml:space="preserve"> ∧ (¬P(x) ∨ (R(x, z) → H(z))))</w:t>
+            </w:r>
+          </w:p>
+        </w:tc>
+        <w:tc>
+          <w:tcPr>
+            <w:tcW w:w="2790" w:type="dxa"/>
+            <w:vAlign w:val="center"/>
+          </w:tcPr>
+          <w:p>
+            <w:pPr>
+              <w:jc w:val="center"/>
+              <w:rPr>
+                <w:rFonts w:ascii="Cambria Math" w:hAnsi="Cambria Math" w:cs="Cambria Math"/>
+              </w:rPr>
+            </w:pPr>
+            <w:r>
+              <w:rPr>
+                <w:rFonts w:ascii="Cambria Math" w:hAnsi="Cambria Math" w:cs="Cambria Math"/>
+              </w:rPr>
+              <w:t>∀</w:t>
+            </w:r>
+            <w:proofErr w:type="spellStart"/>
+            <w:r>
+              <w:rPr>
+                <w:rFonts w:ascii="Cambria Math" w:hAnsi="Cambria Math" w:cs="Cambria Math"/>
+              </w:rPr>
+              <w:t>xF</w:t>
+            </w:r>
+            <w:proofErr w:type="spellEnd"/>
+            <w:r>
+              <w:rPr>
+                <w:rFonts w:ascii="Cambria Math" w:hAnsi="Cambria Math" w:cs="Cambria Math"/>
+              </w:rPr>
+              <w:t xml:space="preserve"> ∧ G ≡ ∀x(F ∧ G)</w:t>
+            </w:r>
+            <w:r>
+              <w:rPr>
+                <w:rFonts w:ascii="Cambria Math" w:hAnsi="Cambria Math" w:cs="Cambria Math"/>
+              </w:rPr>
+              <w:t xml:space="preserve"> </w:t>
+            </w:r>
+            <w:r>
+              <w:rPr>
+                <w:rFonts w:ascii="Cambria Math" w:hAnsi="Cambria Math" w:cs="Cambria Math"/>
+              </w:rPr>
+              <w:br/>
+            </w:r>
+            <w:r>
+              <w:rPr>
+                <w:rFonts w:ascii="Cambria Math" w:hAnsi="Cambria Math" w:cs="Cambria Math"/>
+              </w:rPr>
+              <w:t xml:space="preserve">and </w:t>
+            </w:r>
+            <w:r>
+              <w:rPr>
+                <w:rFonts w:ascii="Cambria Math" w:hAnsi="Cambria Math" w:cs="Cambria Math"/>
+              </w:rPr>
+              <w:t>∃</w:t>
+            </w:r>
+            <w:proofErr w:type="spellStart"/>
+            <w:r>
+              <w:rPr>
+                <w:rFonts w:ascii="Cambria Math" w:hAnsi="Cambria Math" w:cs="Cambria Math"/>
+              </w:rPr>
+              <w:t>xF</w:t>
+            </w:r>
+            <w:proofErr w:type="spellEnd"/>
+            <w:r>
+              <w:rPr>
+                <w:rFonts w:ascii="Cambria Math" w:hAnsi="Cambria Math" w:cs="Cambria Math"/>
+              </w:rPr>
+              <w:t xml:space="preserve"> ∧ G ≡ ∃x(F ∧ G)</w:t>
+            </w:r>
+          </w:p>
+        </w:tc>
+      </w:tr>
+      <w:tr>
+        <w:tc>
+          <w:tcPr>
+            <w:tcW w:w="7650" w:type="dxa"/>
+            <w:vAlign w:val="center"/>
+          </w:tcPr>
+          <w:p>
+            <w:pPr>
+              <w:jc w:val="center"/>
+              <w:rPr>
+                <w:rFonts w:ascii="Cambria Math" w:hAnsi="Cambria Math" w:cs="Cambria Math"/>
+              </w:rPr>
+            </w:pPr>
+            <w:r>
+              <w:rPr>
+                <w:rFonts w:ascii="Cambria Math" w:hAnsi="Cambria Math" w:cs="Cambria Math"/>
+              </w:rPr>
+              <w:t>∀</w:t>
+            </w:r>
+            <w:proofErr w:type="spellStart"/>
+            <w:r>
+              <w:rPr>
+                <w:rFonts w:ascii="Cambria Math" w:hAnsi="Cambria Math" w:cs="Cambria Math"/>
+              </w:rPr>
+              <w:t>z∀x∃y</w:t>
+            </w:r>
+            <w:proofErr w:type="spellEnd"/>
+            <w:r>
+              <w:rPr>
+                <w:rFonts w:ascii="Cambria Math" w:hAnsi="Cambria Math" w:cs="Cambria Math"/>
+              </w:rPr>
+              <w:t xml:space="preserve">((P(x) → (O(x, y) ∧ C(y))) ∧ </w:t>
+            </w:r>
+            <w:r>
+              <w:rPr>
+                <w:rFonts w:ascii="Cambria Math" w:hAnsi="Cambria Math" w:cs="Cambria Math"/>
+              </w:rPr>
+              <w:t>(¬P(x) ∨ (R(x, z) → H(z))))</w:t>
+            </w:r>
+          </w:p>
+        </w:tc>
+        <w:tc>
+          <w:tcPr>
+            <w:tcW w:w="2790" w:type="dxa"/>
+            <w:vAlign w:val="center"/>
+          </w:tcPr>
+          <w:p>
+            <w:pPr>
+              <w:jc w:val="center"/>
+              <w:rPr>
+                <w:rFonts w:ascii="Cambria Math" w:hAnsi="Cambria Math" w:cs="Cambria Math"/>
+              </w:rPr>
+            </w:pPr>
+            <w:r>
+              <w:t>Def. of conditionals</w:t>
+            </w:r>
+          </w:p>
+        </w:tc>
+      </w:tr>
+      <w:tr>
+        <w:tc>
+          <w:tcPr>
+            <w:tcW w:w="7650" w:type="dxa"/>
+            <w:vAlign w:val="center"/>
+          </w:tcPr>
+          <w:p>
+            <w:pPr>
+              <w:jc w:val="center"/>
+              <w:rPr>
+                <w:rFonts w:ascii="Cambria Math" w:hAnsi="Cambria Math" w:cs="Cambria Math"/>
+              </w:rPr>
+            </w:pPr>
+            <w:r>
+              <w:rPr>
+                <w:rFonts w:ascii="Cambria Math" w:hAnsi="Cambria Math" w:cs="Cambria Math"/>
+              </w:rPr>
+              <w:t>∀</w:t>
+            </w:r>
+            <w:proofErr w:type="spellStart"/>
+            <w:r>
+              <w:rPr>
+                <w:rFonts w:ascii="Cambria Math" w:hAnsi="Cambria Math" w:cs="Cambria Math"/>
+              </w:rPr>
+              <w:t>z∀x∃y</w:t>
+            </w:r>
+            <w:proofErr w:type="spellEnd"/>
+            <w:r>
+              <w:rPr>
+                <w:rFonts w:ascii="Cambria Math" w:hAnsi="Cambria Math" w:cs="Cambria Math"/>
+              </w:rPr>
+              <w:t xml:space="preserve">((P(x) → (O(x, y) ∧ C(y))) ∧ </w:t>
+            </w:r>
+            <w:r>
+              <w:rPr>
+                <w:rFonts w:ascii="Cambria Math" w:hAnsi="Cambria Math" w:cs="Cambria Math"/>
+              </w:rPr>
+              <w:t>(¬P(x) ∨ ¬R(x, z) ∨ H(z)))</w:t>
+            </w:r>
+          </w:p>
+        </w:tc>
+        <w:tc>
+          <w:tcPr>
+            <w:tcW w:w="2790" w:type="dxa"/>
+            <w:vAlign w:val="center"/>
+          </w:tcPr>
+          <w:p>
+            <w:pPr>
+              <w:jc w:val="center"/>
+            </w:pPr>
+            <w:r>
+              <w:t>Def. of conditionals</w:t>
+            </w:r>
+          </w:p>
+        </w:tc>
+      </w:tr>
+      <w:tr>
+        <w:tc>
+          <w:tcPr>
+            <w:tcW w:w="7650" w:type="dxa"/>
+            <w:vAlign w:val="center"/>
+          </w:tcPr>
+          <w:p>
+            <w:pPr>
+              <w:jc w:val="center"/>
+              <w:rPr>
+                <w:rFonts w:ascii="Cambria Math" w:hAnsi="Cambria Math" w:cs="Cambria Math"/>
+              </w:rPr>
+            </w:pPr>
+            <w:r>
+              <w:rPr>
+                <w:rFonts w:ascii="Cambria Math" w:hAnsi="Cambria Math" w:cs="Cambria Math"/>
+              </w:rPr>
+              <w:t>∀</w:t>
+            </w:r>
+            <w:proofErr w:type="spellStart"/>
+            <w:r>
+              <w:rPr>
+                <w:rFonts w:ascii="Cambria Math" w:hAnsi="Cambria Math" w:cs="Cambria Math"/>
+              </w:rPr>
+              <w:t>z∀x∃y</w:t>
+            </w:r>
+            <w:proofErr w:type="spellEnd"/>
+            <w:r>
+              <w:rPr>
+                <w:rFonts w:ascii="Cambria Math" w:hAnsi="Cambria Math" w:cs="Cambria Math"/>
+              </w:rPr>
+              <w:t xml:space="preserve">((P(x) → (O(x, y) ∧ C(y))) ∧ </w:t>
+            </w:r>
+            <w:r>
+              <w:rPr>
+                <w:rFonts w:ascii="Cambria Math" w:hAnsi="Cambria Math" w:cs="Cambria Math"/>
+              </w:rPr>
+              <w:t>(¬</w:t>
+            </w:r>
+            <w:r>
+              <w:rPr>
+                <w:rFonts w:ascii="Cambria Math" w:hAnsi="Cambria Math" w:cs="Cambria Math"/>
+              </w:rPr>
+              <w:t>(</w:t>
+            </w:r>
+            <w:r>
+              <w:rPr>
+                <w:rFonts w:ascii="Cambria Math" w:hAnsi="Cambria Math" w:cs="Cambria Math"/>
+              </w:rPr>
+              <w:t>P(x) ∧ R(x, z)</w:t>
+            </w:r>
+            <w:r>
+              <w:rPr>
+                <w:rFonts w:ascii="Cambria Math" w:hAnsi="Cambria Math" w:cs="Cambria Math"/>
+              </w:rPr>
+              <w:t>)</w:t>
+            </w:r>
+            <w:r>
+              <w:rPr>
+                <w:rFonts w:ascii="Cambria Math" w:hAnsi="Cambria Math" w:cs="Cambria Math"/>
+              </w:rPr>
+              <w:t xml:space="preserve"> ∨ H(z)))</w:t>
+            </w:r>
+          </w:p>
+        </w:tc>
+        <w:tc>
+          <w:tcPr>
+            <w:tcW w:w="2790" w:type="dxa"/>
+            <w:vAlign w:val="center"/>
+          </w:tcPr>
+          <w:p>
+            <w:pPr>
+              <w:jc w:val="center"/>
+            </w:pPr>
+            <w:r>
+              <w:t>de Morgan’s Law</w:t>
+            </w:r>
+          </w:p>
+        </w:tc>
+      </w:tr>
+      <w:tr>
+        <w:tc>
+          <w:tcPr>
+            <w:tcW w:w="7650" w:type="dxa"/>
+            <w:vAlign w:val="center"/>
+          </w:tcPr>
+          <w:p>
+            <w:pPr>
+              <w:jc w:val="center"/>
+              <w:rPr>
+                <w:rFonts w:ascii="Cambria Math" w:hAnsi="Cambria Math" w:cs="Cambria Math"/>
+              </w:rPr>
+            </w:pPr>
+            <w:r>
+              <w:rPr>
+                <w:rFonts w:ascii="Cambria Math" w:hAnsi="Cambria Math" w:cs="Cambria Math"/>
+              </w:rPr>
+              <w:t>∀</w:t>
+            </w:r>
+            <w:proofErr w:type="spellStart"/>
+            <w:r>
+              <w:rPr>
+                <w:rFonts w:ascii="Cambria Math" w:hAnsi="Cambria Math" w:cs="Cambria Math"/>
+              </w:rPr>
+              <w:t>z∀x∃y</w:t>
+            </w:r>
+            <w:proofErr w:type="spellEnd"/>
+            <w:r>
+              <w:rPr>
+                <w:rFonts w:ascii="Cambria Math" w:hAnsi="Cambria Math" w:cs="Cambria Math"/>
+              </w:rPr>
+              <w:t>((P(x) → (O(x, y) ∧ C(y))) ∧ ((P(x) ∧ R(x, z)) → H(z)))</w:t>
+            </w:r>
+          </w:p>
+        </w:tc>
+        <w:tc>
+          <w:tcPr>
+            <w:tcW w:w="2790" w:type="dxa"/>
+            <w:vAlign w:val="center"/>
+          </w:tcPr>
+          <w:p>
+            <w:pPr>
+              <w:jc w:val="center"/>
+            </w:pPr>
+            <w:r>
+              <w:t>Def. of conditionals</w:t>
             </w:r>
           </w:p>
         </w:tc>
@@ -1358,7 +2181,7 @@
   <w:style w:type="paragraph" w:default="1" w:styleId="Normal">
     <w:name w:val="Normal"/>
     <w:qFormat/>
-    <w:rsid w:val="0056664E"/>
+    <w:rsid w:val="002F0933"/>
     <w:pPr>
       <w:suppressAutoHyphens/>
     </w:pPr>
@@ -1572,7 +2395,6 @@
   <w:style w:type="character" w:default="1" w:styleId="DefaultParagraphFont">
     <w:name w:val="Default Paragraph Font"/>
     <w:uiPriority w:val="1"/>
-    <w:semiHidden/>
     <w:unhideWhenUsed/>
   </w:style>
   <w:style w:type="table" w:default="1" w:styleId="TableNormal">

</xml_diff>